<commit_message>
Android V-Model phase 3
</commit_message>
<xml_diff>
--- a/docs/V-Model process - Android.docx
+++ b/docs/V-Model process - Android.docx
@@ -50,6 +50,12 @@
     </w:p>
     <w:sdt>
       <w:sdtPr>
+        <w:rPr>
+          <w:rFonts w:asciiTheme="minorHAnsi" w:eastAsiaTheme="minorEastAsia" w:hAnsiTheme="minorHAnsi" w:cstheme="minorBidi"/>
+          <w:color w:val="auto"/>
+          <w:sz w:val="20"/>
+          <w:szCs w:val="20"/>
+        </w:rPr>
         <w:id w:val="331888114"/>
         <w:docPartObj>
           <w:docPartGallery w:val="Table of Contents"/>
@@ -58,13 +64,9 @@
       </w:sdtPr>
       <w:sdtEndPr>
         <w:rPr>
-          <w:rFonts w:asciiTheme="minorHAnsi" w:eastAsiaTheme="minorEastAsia" w:hAnsiTheme="minorHAnsi" w:cstheme="minorBidi"/>
           <w:b/>
           <w:bCs/>
           <w:noProof/>
-          <w:color w:val="auto"/>
-          <w:sz w:val="20"/>
-          <w:szCs w:val="20"/>
         </w:rPr>
       </w:sdtEndPr>
       <w:sdtContent>
@@ -3796,25 +3798,13 @@
       </w:pPr>
       <w:bookmarkStart w:id="8" w:name="_Toc225163852"/>
       <w:r>
-        <w:t xml:space="preserve">Phase </w:t>
-      </w:r>
-      <w:r>
-        <w:t>2: System Design</w:t>
+        <w:t>Phase 2: System Design</w:t>
       </w:r>
       <w:bookmarkEnd w:id="8"/>
     </w:p>
     <w:p>
       <w:r>
-        <w:t xml:space="preserve">This phase directly corresponds with the </w:t>
-      </w:r>
-      <w:r>
-        <w:t>Integration</w:t>
-      </w:r>
-      <w:r>
-        <w:t xml:space="preserve"> test phase</w:t>
-      </w:r>
-      <w:r>
-        <w:t>.</w:t>
+        <w:t>This phase directly corresponds with the Integration test phase.</w:t>
       </w:r>
     </w:p>
     <w:p>
@@ -3837,13 +3827,7 @@
     </w:p>
     <w:p>
       <w:r>
-        <w:t xml:space="preserve">Adopted </w:t>
-      </w:r>
-      <w:r>
-        <w:t xml:space="preserve">the </w:t>
-      </w:r>
-      <w:r>
-        <w:t>MVVM (Model-View-</w:t>
+        <w:t>Adopted the MVVM (Model-View-</w:t>
       </w:r>
       <w:proofErr w:type="spellStart"/>
       <w:r>
@@ -3851,10 +3835,7 @@
       </w:r>
       <w:proofErr w:type="spellEnd"/>
       <w:r>
-        <w:t>)</w:t>
-      </w:r>
-      <w:r>
-        <w:t xml:space="preserve"> architectural pattern, which separates the UI logic (View) from business logic (</w:t>
+        <w:t>) architectural pattern, which separates the UI logic (View) from business logic (</w:t>
       </w:r>
       <w:proofErr w:type="spellStart"/>
       <w:r>
@@ -3878,10 +3859,7 @@
       </w:r>
       <w:proofErr w:type="spellEnd"/>
       <w:r>
-        <w:t xml:space="preserve"> maintainability as code is more organised and easier to understand. The MVVM was implemented</w:t>
-      </w:r>
-      <w:r>
-        <w:t xml:space="preserve"> with the following layers:</w:t>
+        <w:t xml:space="preserve"> maintainability as code is more organised and easier to understand. The MVVM was implemented with the following layers:</w:t>
       </w:r>
     </w:p>
     <w:tbl>
@@ -4471,170 +4449,749 @@
       </w:pPr>
       <w:bookmarkStart w:id="10" w:name="_Toc225163854"/>
       <w:r>
-        <w:t>Navigation Flow</w:t>
+        <w:t>Navigation Flo</w:t>
       </w:r>
       <w:bookmarkEnd w:id="10"/>
+      <w:r>
+        <w:t>w</w:t>
+      </w:r>
     </w:p>
     <w:p>
       <w:r>
+        <w:t xml:space="preserve">There are two destinations defined in </w:t>
+      </w:r>
+      <w:proofErr w:type="spellStart"/>
+      <w:r>
+        <w:t>AppDestinations.kt</w:t>
+      </w:r>
+      <w:proofErr w:type="spellEnd"/>
+      <w:r>
+        <w:t xml:space="preserve">. Login (route: "login") and Home (route: "home"). Login is the </w:t>
+      </w:r>
+      <w:proofErr w:type="spellStart"/>
+      <w:r>
+        <w:t>startDestination</w:t>
+      </w:r>
+      <w:proofErr w:type="spellEnd"/>
+      <w:r>
+        <w:t>. On successful login</w:t>
+      </w:r>
+      <w:r>
+        <w:t>,</w:t>
+      </w:r>
+      <w:r>
+        <w:t xml:space="preserve"> the Login route is popped from the back stack so the user cannot navigate back to</w:t>
+      </w:r>
+      <w:r>
+        <w:t xml:space="preserve"> </w:t>
+      </w:r>
+      <w:r>
+        <w:t>it.</w:t>
+      </w:r>
+    </w:p>
+    <w:p>
+      <w:pPr>
+        <w:jc w:val="center"/>
+      </w:pPr>
+      <w:r>
         <w:rPr>
           <w:noProof/>
         </w:rPr>
-        <mc:AlternateContent>
-          <mc:Choice Requires="wps">
-            <w:drawing>
-              <wp:anchor distT="0" distB="0" distL="114300" distR="114300" simplePos="0" relativeHeight="251659264" behindDoc="0" locked="0" layoutInCell="1" allowOverlap="1" wp14:anchorId="2588B814" wp14:editId="6D7FBBC0">
-                <wp:simplePos x="0" y="0"/>
-                <wp:positionH relativeFrom="column">
-                  <wp:posOffset>135467</wp:posOffset>
-                </wp:positionH>
-                <wp:positionV relativeFrom="paragraph">
-                  <wp:posOffset>558588</wp:posOffset>
-                </wp:positionV>
-                <wp:extent cx="728133" cy="330200"/>
-                <wp:effectExtent l="0" t="0" r="15240" b="12700"/>
-                <wp:wrapNone/>
-                <wp:docPr id="820803270" name="Text Box 1"/>
-                <wp:cNvGraphicFramePr/>
-                <a:graphic xmlns:a="http://schemas.openxmlformats.org/drawingml/2006/main">
-                  <a:graphicData uri="http://schemas.microsoft.com/office/word/2010/wordprocessingShape">
-                    <wps:wsp>
-                      <wps:cNvSpPr txBox="1"/>
-                      <wps:spPr>
-                        <a:xfrm>
-                          <a:off x="0" y="0"/>
-                          <a:ext cx="728133" cy="330200"/>
-                        </a:xfrm>
-                        <a:prstGeom prst="rect">
-                          <a:avLst/>
-                        </a:prstGeom>
-                        <a:ln/>
-                      </wps:spPr>
-                      <wps:style>
-                        <a:lnRef idx="2">
-                          <a:schemeClr val="accent4">
-                            <a:shade val="15000"/>
-                          </a:schemeClr>
-                        </a:lnRef>
-                        <a:fillRef idx="1">
-                          <a:schemeClr val="accent4"/>
-                        </a:fillRef>
-                        <a:effectRef idx="0">
-                          <a:schemeClr val="accent4"/>
-                        </a:effectRef>
-                        <a:fontRef idx="minor">
-                          <a:schemeClr val="lt1"/>
-                        </a:fontRef>
-                      </wps:style>
-                      <wps:txbx>
-                        <w:txbxContent>
-                          <w:p>
-                            <w:pPr>
-                              <w:rPr>
-                                <w:color w:val="000000" w:themeColor="text1"/>
-                                <w:lang w:val="en-GB"/>
-                                <w14:shadow w14:blurRad="38100" w14:dist="19050" w14:dir="2700000" w14:sx="100000" w14:sy="100000" w14:kx="0" w14:ky="0" w14:algn="tl">
-                                  <w14:schemeClr w14:val="dk1">
-                                    <w14:alpha w14:val="60000"/>
-                                  </w14:schemeClr>
-                                </w14:shadow>
-                                <w14:textOutline w14:w="0" w14:cap="flat" w14:cmpd="sng" w14:algn="ctr">
-                                  <w14:noFill/>
-                                  <w14:prstDash w14:val="solid"/>
-                                  <w14:round/>
-                                </w14:textOutline>
-                              </w:rPr>
-                            </w:pPr>
-                            <w:r>
-                              <w:rPr>
-                                <w:color w:val="000000" w:themeColor="text1"/>
-                                <w:lang w:val="en-GB"/>
-                                <w14:shadow w14:blurRad="38100" w14:dist="19050" w14:dir="2700000" w14:sx="100000" w14:sy="100000" w14:kx="0" w14:ky="0" w14:algn="tl">
-                                  <w14:schemeClr w14:val="dk1">
-                                    <w14:alpha w14:val="60000"/>
-                                  </w14:schemeClr>
-                                </w14:shadow>
-                                <w14:textOutline w14:w="0" w14:cap="flat" w14:cmpd="sng" w14:algn="ctr">
-                                  <w14:noFill/>
-                                  <w14:prstDash w14:val="solid"/>
-                                  <w14:round/>
-                                </w14:textOutline>
-                              </w:rPr>
-                              <w:t>App Start</w:t>
-                            </w:r>
-                          </w:p>
-                        </w:txbxContent>
-                      </wps:txbx>
-                      <wps:bodyPr rot="0" spcFirstLastPara="0" vertOverflow="overflow" horzOverflow="overflow" vert="horz" wrap="square" lIns="91440" tIns="45720" rIns="91440" bIns="45720" numCol="1" spcCol="0" rtlCol="0" fromWordArt="0" anchor="t" anchorCtr="0" forceAA="0" compatLnSpc="1">
-                        <a:prstTxWarp prst="textNoShape">
-                          <a:avLst/>
-                        </a:prstTxWarp>
-                        <a:noAutofit/>
-                      </wps:bodyPr>
-                    </wps:wsp>
-                  </a:graphicData>
-                </a:graphic>
-                <wp14:sizeRelH relativeFrom="margin">
-                  <wp14:pctWidth>0</wp14:pctWidth>
-                </wp14:sizeRelH>
-                <wp14:sizeRelV relativeFrom="margin">
-                  <wp14:pctHeight>0</wp14:pctHeight>
-                </wp14:sizeRelV>
-              </wp:anchor>
-            </w:drawing>
-          </mc:Choice>
-          <mc:Fallback>
-            <w:pict>
-              <v:shapetype w14:anchorId="2588B814" id="_x0000_t202" coordsize="21600,21600" o:spt="202" path="m,l,21600r21600,l21600,xe">
-                <v:stroke joinstyle="miter"/>
-                <v:path gradientshapeok="t" o:connecttype="rect"/>
-              </v:shapetype>
-              <v:shape id="Text Box 1" o:spid="_x0000_s1026" type="#_x0000_t202" style="position:absolute;margin-left:10.65pt;margin-top:44pt;width:57.35pt;height:26pt;z-index:251659264;visibility:visible;mso-wrap-style:square;mso-width-percent:0;mso-height-percent:0;mso-wrap-distance-left:9pt;mso-wrap-distance-top:0;mso-wrap-distance-right:9pt;mso-wrap-distance-bottom:0;mso-position-horizontal:absolute;mso-position-horizontal-relative:text;mso-position-vertical:absolute;mso-position-vertical-relative:text;mso-width-percent:0;mso-height-percent:0;mso-width-relative:margin;mso-height-relative:margin;v-text-anchor:top" o:gfxdata="UEsDBBQABgAIAAAAIQC2gziS/gAAAOEBAAATAAAAW0NvbnRlbnRfVHlwZXNdLnhtbJSRQU7DMBBF&#10;90jcwfIWJU67QAgl6YK0S0CoHGBkTxKLZGx5TGhvj5O2G0SRWNoz/78nu9wcxkFMGNg6quQqL6RA&#10;0s5Y6ir5vt9lD1JwBDIwOMJKHpHlpr69KfdHjyxSmriSfYz+USnWPY7AufNIadK6MEJMx9ApD/oD&#10;OlTrorhX2lFEilmcO2RdNtjC5xDF9pCuTyYBB5bi6bQ4syoJ3g9WQ0ymaiLzg5KdCXlKLjvcW893&#10;SUOqXwnz5DrgnHtJTxOsQfEKIT7DmDSUCaxw7Rqn8787ZsmRM9e2VmPeBN4uqYvTtW7jvijg9N/y&#10;JsXecLq0q+WD6m8AAAD//wMAUEsDBBQABgAIAAAAIQA4/SH/1gAAAJQBAAALAAAAX3JlbHMvLnJl&#10;bHOkkMFqwzAMhu+DvYPRfXGawxijTi+j0GvpHsDYimMaW0Yy2fr2M4PBMnrbUb/Q94l/f/hMi1qR&#10;JVI2sOt6UJgd+ZiDgffL8ekFlFSbvV0oo4EbChzGx4f9GRdb25HMsYhqlCwG5lrLq9biZkxWOiqY&#10;22YiTra2kYMu1l1tQD30/bPm3wwYN0x18gb45AdQl1tp5j/sFB2T0FQ7R0nTNEV3j6o9feQzro1i&#10;OWA14Fm+Q8a1a8+Bvu/d/dMb2JY5uiPbhG/ktn4cqGU/er3pcvwCAAD//wMAUEsDBBQABgAIAAAA&#10;IQD9GBx7ZgIAACwFAAAOAAAAZHJzL2Uyb0RvYy54bWysVE1v2zAMvQ/YfxB0X20n6doFdYqsRYcB&#10;RVusHXpWZKk2IIuaxMTOfv0oOXGCrtiAYReb4scj9Ujq4rJvDdsoHxqwJS9Ocs6UlVA19qXk359u&#10;PpxzFlDYShiwquRbFfjl4v27i87N1QRqMJXyjEBsmHeu5DWim2dZkLVqRTgBpywZNfhWIB39S1Z5&#10;0RF6a7JJnn/MOvCV8yBVCKS9Hox8kfC1VhLvtQ4KmSk51Ybp69N3Fb/Z4kLMX7xwdSN3ZYh/qKIV&#10;jaWkI9S1QMHWvvkNqm2khwAaTyS0GWjdSJXuQLcp8le3eayFU+kuRE5wI03h/8HKu82je/AM+8/Q&#10;UwMjIZ0L80DKeJ9e+zb+qVJGdqJwO9KmemSSlGeT82I65UySaTrNqS0RJTsEOx/wi4KWRaHknrqS&#10;yBKb24CD694l5jI26g5VJAm3Rg3Gb0qzpqK8kwSSRkVdGc82gpospFQWZ4OpFpUa1MVpPpY1RqQi&#10;jSXAiKwbY0bs4k/YQ8k7/xiq0qSNwfnfg8eIlBksjsFtY8G/BWAwdYd41YP/nqSBmsgS9queiovi&#10;Cqot9dXDMPLByZuG2L8VAR+EpxmnVtLe4j19tIGu5LCTOKvB/3xLH/1p9MjKWUc7U/LwYy284sx8&#10;tTSUn4rZLC5ZOsxOzyZ08MeW1bHFrtsroI4V9EI4mcToj2Yvag/tM633MmYlk7CScpcc9+IVDptM&#10;z4NUy2VyorVyAm/to5MROtIbZ+upfxbe7QYQaXLvYL9dYv5qDgffGGlhuUbQTRrSA6s74mkl0wTt&#10;no+488fn5HV45Ba/AAAA//8DAFBLAwQUAAYACAAAACEAIOHGC98AAAAJAQAADwAAAGRycy9kb3du&#10;cmV2LnhtbEyPzU7DMBCE70i8g7VI3KidBKqQxqkQPxKXHmhBvbqOE0eN11HspuHt2Z7obVYzmv2m&#10;XM+uZ5MZQ+dRQrIQwAxqX3fYSvjefTzkwEJUWKveo5HwawKsq9ubUhW1P+OXmbaxZVSCoVASbIxD&#10;wXnQ1jgVFn4wSF7jR6cinWPL61Gdqdz1PBViyZ3qkD5YNZhXa/Rxe3ISNp9No6ef5E3vcv+U2ffn&#10;dL/fSHl/N7+sgEUzx/8wXPAJHSpiOvgT1oH1EtIko6SEPKdJFz9bkjiQeBQCeFXy6wXVHwAAAP//&#10;AwBQSwECLQAUAAYACAAAACEAtoM4kv4AAADhAQAAEwAAAAAAAAAAAAAAAAAAAAAAW0NvbnRlbnRf&#10;VHlwZXNdLnhtbFBLAQItABQABgAIAAAAIQA4/SH/1gAAAJQBAAALAAAAAAAAAAAAAAAAAC8BAABf&#10;cmVscy8ucmVsc1BLAQItABQABgAIAAAAIQD9GBx7ZgIAACwFAAAOAAAAAAAAAAAAAAAAAC4CAABk&#10;cnMvZTJvRG9jLnhtbFBLAQItABQABgAIAAAAIQAg4cYL3wAAAAkBAAAPAAAAAAAAAAAAAAAAAMAE&#10;AABkcnMvZG93bnJldi54bWxQSwUGAAAAAAQABADzAAAAzAUAAAAA&#10;" fillcolor="#0f9ed5 [3207]" strokecolor="#02171f [487]" strokeweight="1.5pt">
-                <v:textbox>
-                  <w:txbxContent>
-                    <w:p>
-                      <w:pPr>
-                        <w:rPr>
-                          <w:color w:val="000000" w:themeColor="text1"/>
-                          <w:lang w:val="en-GB"/>
-                          <w14:shadow w14:blurRad="38100" w14:dist="19050" w14:dir="2700000" w14:sx="100000" w14:sy="100000" w14:kx="0" w14:ky="0" w14:algn="tl">
-                            <w14:schemeClr w14:val="dk1">
-                              <w14:alpha w14:val="60000"/>
-                            </w14:schemeClr>
-                          </w14:shadow>
-                          <w14:textOutline w14:w="0" w14:cap="flat" w14:cmpd="sng" w14:algn="ctr">
-                            <w14:noFill/>
-                            <w14:prstDash w14:val="solid"/>
-                            <w14:round/>
-                          </w14:textOutline>
-                        </w:rPr>
-                      </w:pPr>
-                      <w:r>
-                        <w:rPr>
-                          <w:color w:val="000000" w:themeColor="text1"/>
-                          <w:lang w:val="en-GB"/>
-                          <w14:shadow w14:blurRad="38100" w14:dist="19050" w14:dir="2700000" w14:sx="100000" w14:sy="100000" w14:kx="0" w14:ky="0" w14:algn="tl">
-                            <w14:schemeClr w14:val="dk1">
-                              <w14:alpha w14:val="60000"/>
-                            </w14:schemeClr>
-                          </w14:shadow>
-                          <w14:textOutline w14:w="0" w14:cap="flat" w14:cmpd="sng" w14:algn="ctr">
-                            <w14:noFill/>
-                            <w14:prstDash w14:val="solid"/>
-                            <w14:round/>
-                          </w14:textOutline>
-                        </w:rPr>
-                        <w:t>App Start</w:t>
-                      </w:r>
-                    </w:p>
-                  </w:txbxContent>
-                </v:textbox>
-              </v:shape>
-            </w:pict>
-          </mc:Fallback>
-        </mc:AlternateContent>
+        <w:drawing>
+          <wp:inline distT="0" distB="0" distL="0" distR="0" wp14:anchorId="32BFADB3" wp14:editId="7E777754">
+            <wp:extent cx="4900930" cy="1921060"/>
+            <wp:effectExtent l="0" t="0" r="0" b="3175"/>
+            <wp:docPr id="304777841" name="Picture 1"/>
+            <wp:cNvGraphicFramePr>
+              <a:graphicFrameLocks xmlns:a="http://schemas.openxmlformats.org/drawingml/2006/main" noChangeAspect="1"/>
+            </wp:cNvGraphicFramePr>
+            <a:graphic xmlns:a="http://schemas.openxmlformats.org/drawingml/2006/main">
+              <a:graphicData uri="http://schemas.openxmlformats.org/drawingml/2006/picture">
+                <pic:pic xmlns:pic="http://schemas.openxmlformats.org/drawingml/2006/picture">
+                  <pic:nvPicPr>
+                    <pic:cNvPr id="304777841" name=""/>
+                    <pic:cNvPicPr/>
+                  </pic:nvPicPr>
+                  <pic:blipFill>
+                    <a:blip r:embed="rId6"/>
+                    <a:stretch>
+                      <a:fillRect/>
+                    </a:stretch>
+                  </pic:blipFill>
+                  <pic:spPr>
+                    <a:xfrm>
+                      <a:off x="0" y="0"/>
+                      <a:ext cx="4905566" cy="1922877"/>
+                    </a:xfrm>
+                    <a:prstGeom prst="rect">
+                      <a:avLst/>
+                    </a:prstGeom>
+                  </pic:spPr>
+                </pic:pic>
+              </a:graphicData>
+            </a:graphic>
+          </wp:inline>
+        </w:drawing>
       </w:r>
     </w:p>
+    <w:p>
+      <w:pPr>
+        <w:pStyle w:val="Heading3"/>
+        <w:numPr>
+          <w:ilvl w:val="1"/>
+          <w:numId w:val="1"/>
+        </w:numPr>
+      </w:pPr>
+      <w:r>
+        <w:t>System Test Scenarios</w:t>
+      </w:r>
+    </w:p>
+    <w:p/>
+    <w:tbl>
+      <w:tblPr>
+        <w:tblStyle w:val="GridTable1Light"/>
+        <w:tblW w:w="0" w:type="auto"/>
+        <w:tblLook w:val="04A0" w:firstRow="1" w:lastRow="0" w:firstColumn="1" w:lastColumn="0" w:noHBand="0" w:noVBand="1"/>
+      </w:tblPr>
+      <w:tblGrid>
+        <w:gridCol w:w="911"/>
+        <w:gridCol w:w="4859"/>
+        <w:gridCol w:w="2886"/>
+      </w:tblGrid>
+      <w:tr>
+        <w:trPr>
+          <w:cnfStyle w:val="100000000000" w:firstRow="1" w:lastRow="0" w:firstColumn="0" w:lastColumn="0" w:oddVBand="0" w:evenVBand="0" w:oddHBand="0" w:evenHBand="0" w:firstRowFirstColumn="0" w:firstRowLastColumn="0" w:lastRowFirstColumn="0" w:lastRowLastColumn="0"/>
+        </w:trPr>
+        <w:tc>
+          <w:tcPr>
+            <w:cnfStyle w:val="001000000000" w:firstRow="0" w:lastRow="0" w:firstColumn="1" w:lastColumn="0" w:oddVBand="0" w:evenVBand="0" w:oddHBand="0" w:evenHBand="0" w:firstRowFirstColumn="0" w:firstRowLastColumn="0" w:lastRowFirstColumn="0" w:lastRowLastColumn="0"/>
+            <w:tcW w:w="911" w:type="dxa"/>
+          </w:tcPr>
+          <w:p>
+            <w:r>
+              <w:t>ID</w:t>
+            </w:r>
+          </w:p>
+        </w:tc>
+        <w:tc>
+          <w:tcPr>
+            <w:tcW w:w="4859" w:type="dxa"/>
+          </w:tcPr>
+          <w:p>
+            <w:pPr>
+              <w:cnfStyle w:val="100000000000" w:firstRow="1" w:lastRow="0" w:firstColumn="0" w:lastColumn="0" w:oddVBand="0" w:evenVBand="0" w:oddHBand="0" w:evenHBand="0" w:firstRowFirstColumn="0" w:firstRowLastColumn="0" w:lastRowFirstColumn="0" w:lastRowLastColumn="0"/>
+            </w:pPr>
+            <w:r>
+              <w:t>Scenario</w:t>
+            </w:r>
+          </w:p>
+        </w:tc>
+        <w:tc>
+          <w:tcPr>
+            <w:tcW w:w="2886" w:type="dxa"/>
+          </w:tcPr>
+          <w:p>
+            <w:pPr>
+              <w:cnfStyle w:val="100000000000" w:firstRow="1" w:lastRow="0" w:firstColumn="0" w:lastColumn="0" w:oddVBand="0" w:evenVBand="0" w:oddHBand="0" w:evenHBand="0" w:firstRowFirstColumn="0" w:firstRowLastColumn="0" w:lastRowFirstColumn="0" w:lastRowLastColumn="0"/>
+            </w:pPr>
+            <w:r>
+              <w:t>Expected Result</w:t>
+            </w:r>
+          </w:p>
+        </w:tc>
+      </w:tr>
+      <w:tr>
+        <w:tc>
+          <w:tcPr>
+            <w:cnfStyle w:val="001000000000" w:firstRow="0" w:lastRow="0" w:firstColumn="1" w:lastColumn="0" w:oddVBand="0" w:evenVBand="0" w:oddHBand="0" w:evenHBand="0" w:firstRowFirstColumn="0" w:firstRowLastColumn="0" w:lastRowFirstColumn="0" w:lastRowLastColumn="0"/>
+            <w:tcW w:w="911" w:type="dxa"/>
+          </w:tcPr>
+          <w:p>
+            <w:r>
+              <w:t>ST-01</w:t>
+            </w:r>
+          </w:p>
+        </w:tc>
+        <w:tc>
+          <w:tcPr>
+            <w:tcW w:w="4859" w:type="dxa"/>
+          </w:tcPr>
+          <w:p>
+            <w:pPr>
+              <w:cnfStyle w:val="000000000000" w:firstRow="0" w:lastRow="0" w:firstColumn="0" w:lastColumn="0" w:oddVBand="0" w:evenVBand="0" w:oddHBand="0" w:evenHBand="0" w:firstRowFirstColumn="0" w:firstRowLastColumn="0" w:lastRowFirstColumn="0" w:lastRowLastColumn="0"/>
+            </w:pPr>
+            <w:r>
+              <w:t>Launch app with no active session</w:t>
+            </w:r>
+          </w:p>
+        </w:tc>
+        <w:tc>
+          <w:tcPr>
+            <w:tcW w:w="2886" w:type="dxa"/>
+          </w:tcPr>
+          <w:p>
+            <w:pPr>
+              <w:cnfStyle w:val="000000000000" w:firstRow="0" w:lastRow="0" w:firstColumn="0" w:lastColumn="0" w:oddVBand="0" w:evenVBand="0" w:oddHBand="0" w:evenHBand="0" w:firstRowFirstColumn="0" w:firstRowLastColumn="0" w:lastRowFirstColumn="0" w:lastRowLastColumn="0"/>
+            </w:pPr>
+            <w:proofErr w:type="spellStart"/>
+            <w:r>
+              <w:t>LoginScreen</w:t>
+            </w:r>
+            <w:proofErr w:type="spellEnd"/>
+            <w:r>
+              <w:t xml:space="preserve"> is shown, </w:t>
+            </w:r>
+            <w:proofErr w:type="spellStart"/>
+            <w:r>
+              <w:t>HomeScreen</w:t>
+            </w:r>
+            <w:proofErr w:type="spellEnd"/>
+            <w:r>
+              <w:t xml:space="preserve"> is not accessible</w:t>
+            </w:r>
+          </w:p>
+        </w:tc>
+      </w:tr>
+      <w:tr>
+        <w:tc>
+          <w:tcPr>
+            <w:cnfStyle w:val="001000000000" w:firstRow="0" w:lastRow="0" w:firstColumn="1" w:lastColumn="0" w:oddVBand="0" w:evenVBand="0" w:oddHBand="0" w:evenHBand="0" w:firstRowFirstColumn="0" w:firstRowLastColumn="0" w:lastRowFirstColumn="0" w:lastRowLastColumn="0"/>
+            <w:tcW w:w="911" w:type="dxa"/>
+          </w:tcPr>
+          <w:p>
+            <w:r>
+              <w:t>ST-02</w:t>
+            </w:r>
+          </w:p>
+        </w:tc>
+        <w:tc>
+          <w:tcPr>
+            <w:tcW w:w="4859" w:type="dxa"/>
+          </w:tcPr>
+          <w:p>
+            <w:pPr>
+              <w:cnfStyle w:val="000000000000" w:firstRow="0" w:lastRow="0" w:firstColumn="0" w:lastColumn="0" w:oddVBand="0" w:evenVBand="0" w:oddHBand="0" w:evenHBand="0" w:firstRowFirstColumn="0" w:firstRowLastColumn="0" w:lastRowFirstColumn="0" w:lastRowLastColumn="0"/>
+            </w:pPr>
+            <w:r>
+              <w:t xml:space="preserve">Login with valid Firebase </w:t>
+            </w:r>
+            <w:r>
+              <w:t>credentials</w:t>
+            </w:r>
+          </w:p>
+        </w:tc>
+        <w:tc>
+          <w:tcPr>
+            <w:tcW w:w="2886" w:type="dxa"/>
+          </w:tcPr>
+          <w:p>
+            <w:pPr>
+              <w:cnfStyle w:val="000000000000" w:firstRow="0" w:lastRow="0" w:firstColumn="0" w:lastColumn="0" w:oddVBand="0" w:evenVBand="0" w:oddHBand="0" w:evenHBand="0" w:firstRowFirstColumn="0" w:firstRowLastColumn="0" w:lastRowFirstColumn="0" w:lastRowLastColumn="0"/>
+            </w:pPr>
+            <w:r>
+              <w:t xml:space="preserve">Navigates to </w:t>
+            </w:r>
+            <w:proofErr w:type="spellStart"/>
+            <w:r>
+              <w:t>HomeScreen</w:t>
+            </w:r>
+            <w:proofErr w:type="spellEnd"/>
+            <w:r>
+              <w:t>, Login removed from back stack</w:t>
+            </w:r>
+          </w:p>
+        </w:tc>
+      </w:tr>
+      <w:tr>
+        <w:tc>
+          <w:tcPr>
+            <w:cnfStyle w:val="001000000000" w:firstRow="0" w:lastRow="0" w:firstColumn="1" w:lastColumn="0" w:oddVBand="0" w:evenVBand="0" w:oddHBand="0" w:evenHBand="0" w:firstRowFirstColumn="0" w:firstRowLastColumn="0" w:lastRowFirstColumn="0" w:lastRowLastColumn="0"/>
+            <w:tcW w:w="911" w:type="dxa"/>
+          </w:tcPr>
+          <w:p>
+            <w:r>
+              <w:t>ST-03</w:t>
+            </w:r>
+          </w:p>
+        </w:tc>
+        <w:tc>
+          <w:tcPr>
+            <w:tcW w:w="4859" w:type="dxa"/>
+          </w:tcPr>
+          <w:p>
+            <w:pPr>
+              <w:cnfStyle w:val="000000000000" w:firstRow="0" w:lastRow="0" w:firstColumn="0" w:lastColumn="0" w:oddVBand="0" w:evenVBand="0" w:oddHBand="0" w:evenHBand="0" w:firstRowFirstColumn="0" w:firstRowLastColumn="0" w:lastRowFirstColumn="0" w:lastRowLastColumn="0"/>
+            </w:pPr>
+            <w:r>
+              <w:t xml:space="preserve">Press back from </w:t>
+            </w:r>
+            <w:proofErr w:type="spellStart"/>
+            <w:r>
+              <w:t>HomeScreen</w:t>
+            </w:r>
+            <w:proofErr w:type="spellEnd"/>
+            <w:r>
+              <w:t xml:space="preserve"> after login</w:t>
+            </w:r>
+          </w:p>
+        </w:tc>
+        <w:tc>
+          <w:tcPr>
+            <w:tcW w:w="2886" w:type="dxa"/>
+          </w:tcPr>
+          <w:p>
+            <w:pPr>
+              <w:cnfStyle w:val="000000000000" w:firstRow="0" w:lastRow="0" w:firstColumn="0" w:lastColumn="0" w:oddVBand="0" w:evenVBand="0" w:oddHBand="0" w:evenHBand="0" w:firstRowFirstColumn="0" w:firstRowLastColumn="0" w:lastRowFirstColumn="0" w:lastRowLastColumn="0"/>
+            </w:pPr>
+            <w:r>
+              <w:t>App exits, does not return to Login Screen</w:t>
+            </w:r>
+          </w:p>
+        </w:tc>
+      </w:tr>
+      <w:tr>
+        <w:tc>
+          <w:tcPr>
+            <w:cnfStyle w:val="001000000000" w:firstRow="0" w:lastRow="0" w:firstColumn="1" w:lastColumn="0" w:oddVBand="0" w:evenVBand="0" w:oddHBand="0" w:evenHBand="0" w:firstRowFirstColumn="0" w:firstRowLastColumn="0" w:lastRowFirstColumn="0" w:lastRowLastColumn="0"/>
+            <w:tcW w:w="911" w:type="dxa"/>
+          </w:tcPr>
+          <w:p>
+            <w:r>
+              <w:lastRenderedPageBreak/>
+              <w:t>ST-04</w:t>
+            </w:r>
+          </w:p>
+        </w:tc>
+        <w:tc>
+          <w:tcPr>
+            <w:tcW w:w="4859" w:type="dxa"/>
+          </w:tcPr>
+          <w:p>
+            <w:pPr>
+              <w:cnfStyle w:val="000000000000" w:firstRow="0" w:lastRow="0" w:firstColumn="0" w:lastColumn="0" w:oddVBand="0" w:evenVBand="0" w:oddHBand="0" w:evenHBand="0" w:firstRowFirstColumn="0" w:firstRowLastColumn="0" w:lastRowFirstColumn="0" w:lastRowLastColumn="0"/>
+            </w:pPr>
+            <w:r>
+              <w:t>Sign out from drawer</w:t>
+            </w:r>
+          </w:p>
+        </w:tc>
+        <w:tc>
+          <w:tcPr>
+            <w:tcW w:w="2886" w:type="dxa"/>
+          </w:tcPr>
+          <w:p>
+            <w:pPr>
+              <w:cnfStyle w:val="000000000000" w:firstRow="0" w:lastRow="0" w:firstColumn="0" w:lastColumn="0" w:oddVBand="0" w:evenVBand="0" w:oddHBand="0" w:evenHBand="0" w:firstRowFirstColumn="0" w:firstRowLastColumn="0" w:lastRowFirstColumn="0" w:lastRowLastColumn="0"/>
+            </w:pPr>
+            <w:r>
+              <w:t xml:space="preserve">Returns to </w:t>
+            </w:r>
+            <w:proofErr w:type="spellStart"/>
+            <w:r>
+              <w:t>LoginScreen</w:t>
+            </w:r>
+            <w:proofErr w:type="spellEnd"/>
+            <w:r>
+              <w:t xml:space="preserve">, </w:t>
+            </w:r>
+            <w:r>
+              <w:t>clear session</w:t>
+            </w:r>
+            <w:r>
+              <w:t xml:space="preserve">  </w:t>
+            </w:r>
+          </w:p>
+        </w:tc>
+      </w:tr>
+      <w:tr>
+        <w:tc>
+          <w:tcPr>
+            <w:cnfStyle w:val="001000000000" w:firstRow="0" w:lastRow="0" w:firstColumn="1" w:lastColumn="0" w:oddVBand="0" w:evenVBand="0" w:oddHBand="0" w:evenHBand="0" w:firstRowFirstColumn="0" w:firstRowLastColumn="0" w:lastRowFirstColumn="0" w:lastRowLastColumn="0"/>
+            <w:tcW w:w="911" w:type="dxa"/>
+          </w:tcPr>
+          <w:p>
+            <w:r>
+              <w:t>ST-05</w:t>
+            </w:r>
+          </w:p>
+        </w:tc>
+        <w:tc>
+          <w:tcPr>
+            <w:tcW w:w="4859" w:type="dxa"/>
+          </w:tcPr>
+          <w:p>
+            <w:pPr>
+              <w:cnfStyle w:val="000000000000" w:firstRow="0" w:lastRow="0" w:firstColumn="0" w:lastColumn="0" w:oddVBand="0" w:evenVBand="0" w:oddHBand="0" w:evenHBand="0" w:firstRowFirstColumn="0" w:firstRowLastColumn="0" w:lastRowFirstColumn="0" w:lastRowLastColumn="0"/>
+            </w:pPr>
+            <w:r>
+              <w:t>Launch app with existing active session</w:t>
+            </w:r>
+          </w:p>
+        </w:tc>
+        <w:tc>
+          <w:tcPr>
+            <w:tcW w:w="2886" w:type="dxa"/>
+          </w:tcPr>
+          <w:p>
+            <w:pPr>
+              <w:cnfStyle w:val="000000000000" w:firstRow="0" w:lastRow="0" w:firstColumn="0" w:lastColumn="0" w:oddVBand="0" w:evenVBand="0" w:oddHBand="0" w:evenHBand="0" w:firstRowFirstColumn="0" w:firstRowLastColumn="0" w:lastRowFirstColumn="0" w:lastRowLastColumn="0"/>
+            </w:pPr>
+            <w:r>
+              <w:t xml:space="preserve">Goes directly to </w:t>
+            </w:r>
+            <w:proofErr w:type="spellStart"/>
+            <w:r>
+              <w:t>HomeScreen</w:t>
+            </w:r>
+            <w:proofErr w:type="spellEnd"/>
+            <w:r>
+              <w:t xml:space="preserve"> (auto-login)</w:t>
+            </w:r>
+          </w:p>
+        </w:tc>
+      </w:tr>
+      <w:tr>
+        <w:tc>
+          <w:tcPr>
+            <w:cnfStyle w:val="001000000000" w:firstRow="0" w:lastRow="0" w:firstColumn="1" w:lastColumn="0" w:oddVBand="0" w:evenVBand="0" w:oddHBand="0" w:evenHBand="0" w:firstRowFirstColumn="0" w:firstRowLastColumn="0" w:lastRowFirstColumn="0" w:lastRowLastColumn="0"/>
+            <w:tcW w:w="911" w:type="dxa"/>
+          </w:tcPr>
+          <w:p>
+            <w:pPr>
+              <w:rPr>
+                <w:b w:val="0"/>
+                <w:bCs w:val="0"/>
+              </w:rPr>
+            </w:pPr>
+            <w:r>
+              <w:t>ST-06</w:t>
+            </w:r>
+          </w:p>
+        </w:tc>
+        <w:tc>
+          <w:tcPr>
+            <w:tcW w:w="4859" w:type="dxa"/>
+          </w:tcPr>
+          <w:p>
+            <w:pPr>
+              <w:cnfStyle w:val="000000000000" w:firstRow="0" w:lastRow="0" w:firstColumn="0" w:lastColumn="0" w:oddVBand="0" w:evenVBand="0" w:oddHBand="0" w:evenHBand="0" w:firstRowFirstColumn="0" w:firstRowLastColumn="0" w:lastRowFirstColumn="0" w:lastRowLastColumn="0"/>
+            </w:pPr>
+            <w:proofErr w:type="spellStart"/>
+            <w:r>
+              <w:t>HomeScreen</w:t>
+            </w:r>
+            <w:proofErr w:type="spellEnd"/>
+            <w:r>
+              <w:t xml:space="preserve"> loads with active key</w:t>
+            </w:r>
+          </w:p>
+        </w:tc>
+        <w:tc>
+          <w:tcPr>
+            <w:tcW w:w="2886" w:type="dxa"/>
+          </w:tcPr>
+          <w:p>
+            <w:pPr>
+              <w:cnfStyle w:val="000000000000" w:firstRow="0" w:lastRow="0" w:firstColumn="0" w:lastColumn="0" w:oddVBand="0" w:evenVBand="0" w:oddHBand="0" w:evenHBand="0" w:firstRowFirstColumn="0" w:firstRowLastColumn="0" w:lastRowFirstColumn="0" w:lastRowLastColumn="0"/>
+            </w:pPr>
+            <w:r>
+              <w:t xml:space="preserve">Vehicle name, reg and "Key Active" status displayed from </w:t>
+            </w:r>
+            <w:proofErr w:type="spellStart"/>
+            <w:r>
+              <w:t>Firestore</w:t>
+            </w:r>
+            <w:proofErr w:type="spellEnd"/>
+          </w:p>
+        </w:tc>
+      </w:tr>
+      <w:tr>
+        <w:tc>
+          <w:tcPr>
+            <w:cnfStyle w:val="001000000000" w:firstRow="0" w:lastRow="0" w:firstColumn="1" w:lastColumn="0" w:oddVBand="0" w:evenVBand="0" w:oddHBand="0" w:evenHBand="0" w:firstRowFirstColumn="0" w:firstRowLastColumn="0" w:lastRowFirstColumn="0" w:lastRowLastColumn="0"/>
+            <w:tcW w:w="911" w:type="dxa"/>
+          </w:tcPr>
+          <w:p>
+            <w:r>
+              <w:t>ST-07</w:t>
+            </w:r>
+          </w:p>
+        </w:tc>
+        <w:tc>
+          <w:tcPr>
+            <w:tcW w:w="4859" w:type="dxa"/>
+          </w:tcPr>
+          <w:p>
+            <w:pPr>
+              <w:cnfStyle w:val="000000000000" w:firstRow="0" w:lastRow="0" w:firstColumn="0" w:lastColumn="0" w:oddVBand="0" w:evenVBand="0" w:oddHBand="0" w:evenHBand="0" w:firstRowFirstColumn="0" w:firstRowLastColumn="0" w:lastRowFirstColumn="0" w:lastRowLastColumn="0"/>
+            </w:pPr>
+            <w:proofErr w:type="spellStart"/>
+            <w:r>
+              <w:t>HomeScreen</w:t>
+            </w:r>
+            <w:proofErr w:type="spellEnd"/>
+            <w:r>
+              <w:t xml:space="preserve"> loads with revoked key</w:t>
+            </w:r>
+          </w:p>
+        </w:tc>
+        <w:tc>
+          <w:tcPr>
+            <w:tcW w:w="2886" w:type="dxa"/>
+          </w:tcPr>
+          <w:p>
+            <w:pPr>
+              <w:cnfStyle w:val="000000000000" w:firstRow="0" w:lastRow="0" w:firstColumn="0" w:lastColumn="0" w:oddVBand="0" w:evenVBand="0" w:oddHBand="0" w:evenHBand="0" w:firstRowFirstColumn="0" w:firstRowLastColumn="0" w:lastRowFirstColumn="0" w:lastRowLastColumn="0"/>
+            </w:pPr>
+            <w:r>
+              <w:t>Lock/Unlock buttons disabled, "Key Revoked" shown</w:t>
+            </w:r>
+          </w:p>
+        </w:tc>
+      </w:tr>
+    </w:tbl>
+    <w:p>
+      <w:pPr>
+        <w:ind w:left="360"/>
+      </w:pPr>
+    </w:p>
+    <w:p>
+      <w:pPr>
+        <w:pStyle w:val="Heading2"/>
+        <w:numPr>
+          <w:ilvl w:val="0"/>
+          <w:numId w:val="1"/>
+        </w:numPr>
+      </w:pPr>
+      <w:r>
+        <w:t xml:space="preserve">Phase </w:t>
+      </w:r>
+      <w:r>
+        <w:t xml:space="preserve">3: </w:t>
+      </w:r>
+      <w:r>
+        <w:t>Module Design</w:t>
+      </w:r>
+    </w:p>
+    <w:p/>
+    <w:p>
+      <w:r>
+        <w:t xml:space="preserve">This phase focuses on </w:t>
+      </w:r>
+      <w:r>
+        <w:t xml:space="preserve">breaking down the system architecture into individual modules. </w:t>
+      </w:r>
+      <w:r>
+        <w:t xml:space="preserve">In this phase, each module’s </w:t>
+      </w:r>
+      <w:r>
+        <w:t xml:space="preserve">behaviour and responsibilities are defined along with the interfaces between them. </w:t>
+      </w:r>
+      <w:r>
+        <w:t>This phase corresponds with the unit testing phase.</w:t>
+      </w:r>
+    </w:p>
+    <w:p/>
+    <w:p>
+      <w:pPr>
+        <w:pStyle w:val="Heading3"/>
+        <w:numPr>
+          <w:ilvl w:val="1"/>
+          <w:numId w:val="1"/>
+        </w:numPr>
+      </w:pPr>
+      <w:r>
+        <w:t>Security Manager</w:t>
+      </w:r>
+    </w:p>
+    <w:p/>
+    <w:p>
+      <w:r>
+        <w:t xml:space="preserve">This module constructs </w:t>
+      </w:r>
+      <w:r>
+        <w:t>and parses the BLE payloads</w:t>
+      </w:r>
+      <w:r>
+        <w:t xml:space="preserve"> with </w:t>
+      </w:r>
+      <w:r>
+        <w:t>the correct format. The payload has the format [command] : [nonce] : [timestamp]</w:t>
+      </w:r>
+      <w:r>
+        <w:t>. The nonce is a 32 character randomly generated hex string, and the timestamp uses the Unix millisecond value.</w:t>
+      </w:r>
+      <w:r>
+        <w:t xml:space="preserve"> This format of message adheres to functional requirement </w:t>
+      </w:r>
+      <w:r>
+        <w:t xml:space="preserve">FR-06 which aims to prevent replay attacks </w:t>
+      </w:r>
+      <w:r>
+        <w:t>by using a unique nonce and timestamp.</w:t>
+      </w:r>
+    </w:p>
+    <w:p/>
+    <w:p>
+      <w:pPr>
+        <w:pStyle w:val="Heading3"/>
+        <w:numPr>
+          <w:ilvl w:val="1"/>
+          <w:numId w:val="1"/>
+        </w:numPr>
+      </w:pPr>
+      <w:proofErr w:type="spellStart"/>
+      <w:r>
+        <w:t>BleManager</w:t>
+      </w:r>
+      <w:proofErr w:type="spellEnd"/>
+    </w:p>
+    <w:p/>
+    <w:p>
+      <w:r>
+        <w:t xml:space="preserve">This module </w:t>
+      </w:r>
+      <w:r>
+        <w:t xml:space="preserve">implements the </w:t>
+      </w:r>
+      <w:r>
+        <w:t xml:space="preserve">Bluetooth Low Energy </w:t>
+      </w:r>
+      <w:r>
+        <w:t>GATT functionality. The app advertises a custom service with a unique UUID</w:t>
+      </w:r>
+      <w:r>
+        <w:t xml:space="preserve">. The app then </w:t>
+      </w:r>
+      <w:r>
+        <w:t xml:space="preserve">accepts incoming connections from the VACU, which functions as the GATT central. </w:t>
+      </w:r>
+      <w:r>
+        <w:t>The app notifies the VACU upon connection using a GATT characteristic.</w:t>
+      </w:r>
+      <w:r>
+        <w:t xml:space="preserve"> The </w:t>
+      </w:r>
+      <w:proofErr w:type="spellStart"/>
+      <w:r>
+        <w:t>BleManager</w:t>
+      </w:r>
+      <w:proofErr w:type="spellEnd"/>
+      <w:r>
+        <w:t xml:space="preserve"> module only starts once the user grants Bluetooth permissions for the app. </w:t>
+      </w:r>
+    </w:p>
+    <w:p/>
+    <w:p>
+      <w:pPr>
+        <w:pStyle w:val="Heading3"/>
+        <w:numPr>
+          <w:ilvl w:val="1"/>
+          <w:numId w:val="1"/>
+        </w:numPr>
+      </w:pPr>
+      <w:proofErr w:type="spellStart"/>
+      <w:r>
+        <w:t>HomeViewModel</w:t>
+      </w:r>
+      <w:proofErr w:type="spellEnd"/>
+      <w:r>
+        <w:t xml:space="preserve"> BLE integration</w:t>
+      </w:r>
+    </w:p>
+    <w:p/>
+    <w:p>
+      <w:r>
+        <w:t xml:space="preserve">The </w:t>
+      </w:r>
+      <w:proofErr w:type="spellStart"/>
+      <w:r>
+        <w:t>HomeViewModel</w:t>
+      </w:r>
+      <w:proofErr w:type="spellEnd"/>
+      <w:r>
+        <w:t xml:space="preserve"> was </w:t>
+      </w:r>
+      <w:r>
+        <w:t xml:space="preserve">updated to </w:t>
+      </w:r>
+      <w:r>
+        <w:t>integrate BL</w:t>
+      </w:r>
+      <w:r>
+        <w:t xml:space="preserve">E status </w:t>
+      </w:r>
+      <w:r>
+        <w:t xml:space="preserve">into </w:t>
+      </w:r>
+      <w:r>
+        <w:t xml:space="preserve">the UI </w:t>
+      </w:r>
+      <w:proofErr w:type="spellStart"/>
+      <w:r>
+        <w:t>viewmodel</w:t>
+      </w:r>
+      <w:proofErr w:type="spellEnd"/>
+      <w:r>
+        <w:t xml:space="preserve">, checking on unlock/lock for an active BLE connection and </w:t>
+      </w:r>
+      <w:r>
+        <w:t>showing an error on the UI if commands are sent without being connected to the VACU.</w:t>
+      </w:r>
+    </w:p>
+    <w:p/>
+    <w:p>
+      <w:pPr>
+        <w:pStyle w:val="Heading3"/>
+        <w:numPr>
+          <w:ilvl w:val="1"/>
+          <w:numId w:val="1"/>
+        </w:numPr>
+      </w:pPr>
+      <w:r>
+        <w:t>Test Design</w:t>
+      </w:r>
+    </w:p>
+    <w:p>
+      <w:r>
+        <w:t xml:space="preserve">Unit tests were created for </w:t>
+      </w:r>
+      <w:proofErr w:type="spellStart"/>
+      <w:r>
+        <w:t>SecurityManager</w:t>
+      </w:r>
+      <w:proofErr w:type="spellEnd"/>
+      <w:r>
+        <w:t xml:space="preserve"> to check the payload structure, </w:t>
+      </w:r>
+      <w:r>
+        <w:t>nonce generation and checks validity of payload throughout parsing</w:t>
+      </w:r>
+      <w:r>
+        <w:t xml:space="preserve"> process. Integration tests were created for </w:t>
+      </w:r>
+      <w:proofErr w:type="spellStart"/>
+      <w:r>
+        <w:t>BleManager</w:t>
+      </w:r>
+      <w:proofErr w:type="spellEnd"/>
+      <w:r>
+        <w:t xml:space="preserve"> to verify the Bluetooth </w:t>
+      </w:r>
+      <w:r>
+        <w:t>service initialises correctly and starts as disabled.</w:t>
+      </w:r>
+    </w:p>
+    <w:p>
+      <w:pPr>
+        <w:pStyle w:val="ListParagraph"/>
+        <w:ind w:left="792"/>
+      </w:pPr>
+    </w:p>
+    <w:p/>
+    <w:p/>
+    <w:p/>
+    <w:p/>
     <w:sectPr>
       <w:pgSz w:w="11906" w:h="16838"/>
       <w:pgMar w:top="1440" w:right="1440" w:bottom="1440" w:left="1440" w:header="708" w:footer="708" w:gutter="0"/>
@@ -4648,7 +5205,7 @@
 <file path=word/numbering.xml><?xml version="1.0" encoding="utf-8"?>
 <w:numbering xmlns:wpc="http://schemas.microsoft.com/office/word/2010/wordprocessingCanvas" xmlns:cx="http://schemas.microsoft.com/office/drawing/2014/chartex" xmlns:cx1="http://schemas.microsoft.com/office/drawing/2015/9/8/chartex" xmlns:cx2="http://schemas.microsoft.com/office/drawing/2015/10/21/chartex" xmlns:cx3="http://schemas.microsoft.com/office/drawing/2016/5/9/chartex" xmlns:cx4="http://schemas.microsoft.com/office/drawing/2016/5/10/chartex" xmlns:cx5="http://schemas.microsoft.com/office/drawing/2016/5/11/chartex" xmlns:cx6="http://schemas.microsoft.com/office/drawing/2016/5/12/chartex" xmlns:cx7="http://schemas.microsoft.com/office/drawing/2016/5/13/chartex" xmlns:cx8="http://schemas.microsoft.com/office/drawing/2016/5/14/chartex" xmlns:mc="http://schemas.openxmlformats.org/markup-compatibility/2006" xmlns:aink="http://schemas.microsoft.com/office/drawing/2016/ink" xmlns:am3d="http://schemas.microsoft.com/office/drawing/2017/model3d" xmlns:o="urn:schemas-microsoft-com:office:office" xmlns:oel="http://schemas.microsoft.com/office/2019/extlst" xmlns:r="http://schemas.openxmlformats.org/officeDocument/2006/relationships" xmlns:m="http://schemas.openxmlformats.org/officeDocument/2006/math" xmlns:v="urn:schemas-microsoft-com:vml" xmlns:wp14="http://schemas.microsoft.com/office/word/2010/wordprocessingDrawing" xmlns:wp="http://schemas.openxmlformats.org/drawingml/2006/wordprocessingDrawing" xmlns:w10="urn:schemas-microsoft-com:office:word" xmlns:w="http://schemas.openxmlformats.org/wordprocessingml/2006/main" xmlns:w14="http://schemas.microsoft.com/office/word/2010/wordml" xmlns:w15="http://schemas.microsoft.com/office/word/2012/wordml" xmlns:w16cex="http://schemas.microsoft.com/office/word/2018/wordml/cex" xmlns:w16cid="http://schemas.microsoft.com/office/word/2016/wordml/cid" xmlns:w16="http://schemas.microsoft.com/office/word/2018/wordml" xmlns:w16du="http://schemas.microsoft.com/office/word/2023/wordml/word16du" xmlns:w16sdtdh="http://schemas.microsoft.com/office/word/2020/wordml/sdtdatahash" xmlns:w16sdtfl="http://schemas.microsoft.com/office/word/2024/wordml/sdtformatlock" xmlns:w16se="http://schemas.microsoft.com/office/word/2015/wordml/symex" xmlns:wpg="http://schemas.microsoft.com/office/word/2010/wordprocessingGroup" xmlns:wpi="http://schemas.microsoft.com/office/word/2010/wordprocessingInk" xmlns:wne="http://schemas.microsoft.com/office/word/2006/wordml" xmlns:wps="http://schemas.microsoft.com/office/word/2010/wordprocessingShape" mc:Ignorable="w14 w15 w16se w16cid w16 w16cex w16sdtdh w16sdtfl w16du wp14">
   <w:abstractNum w:abstractNumId="0" w15:restartNumberingAfterBreak="0">
-    <w:nsid w:val="2E3F669F"/>
+    <w:nsid w:val="041E15BB"/>
     <w:multiLevelType w:val="multilevel"/>
     <w:tmpl w:val="575E4706"/>
     <w:lvl w:ilvl="0">
@@ -4769,7 +5326,7 @@
     </w:lvl>
   </w:abstractNum>
   <w:abstractNum w:abstractNumId="1" w15:restartNumberingAfterBreak="0">
-    <w:nsid w:val="3E312054"/>
+    <w:nsid w:val="27BF00F8"/>
     <w:multiLevelType w:val="multilevel"/>
     <w:tmpl w:val="575E4706"/>
     <w:lvl w:ilvl="0">
@@ -4889,11 +5446,259 @@
       </w:rPr>
     </w:lvl>
   </w:abstractNum>
+  <w:abstractNum w:abstractNumId="2" w15:restartNumberingAfterBreak="0">
+    <w:nsid w:val="2E3F669F"/>
+    <w:multiLevelType w:val="multilevel"/>
+    <w:tmpl w:val="575E4706"/>
+    <w:lvl w:ilvl="0">
+      <w:start w:val="1"/>
+      <w:numFmt w:val="decimal"/>
+      <w:lvlText w:val="%1."/>
+      <w:lvlJc w:val="left"/>
+      <w:pPr>
+        <w:ind w:left="720" w:hanging="360"/>
+      </w:pPr>
+      <w:rPr>
+        <w:rFonts w:hint="default"/>
+      </w:rPr>
+    </w:lvl>
+    <w:lvl w:ilvl="1">
+      <w:start w:val="1"/>
+      <w:numFmt w:val="decimal"/>
+      <w:isLgl/>
+      <w:lvlText w:val="%1.%2"/>
+      <w:lvlJc w:val="left"/>
+      <w:pPr>
+        <w:ind w:left="792" w:hanging="432"/>
+      </w:pPr>
+      <w:rPr>
+        <w:rFonts w:hint="default"/>
+      </w:rPr>
+    </w:lvl>
+    <w:lvl w:ilvl="2">
+      <w:start w:val="1"/>
+      <w:numFmt w:val="decimal"/>
+      <w:isLgl/>
+      <w:lvlText w:val="%1.%2.%3"/>
+      <w:lvlJc w:val="left"/>
+      <w:pPr>
+        <w:ind w:left="1080" w:hanging="720"/>
+      </w:pPr>
+      <w:rPr>
+        <w:rFonts w:hint="default"/>
+      </w:rPr>
+    </w:lvl>
+    <w:lvl w:ilvl="3">
+      <w:start w:val="1"/>
+      <w:numFmt w:val="decimal"/>
+      <w:isLgl/>
+      <w:lvlText w:val="%1.%2.%3.%4"/>
+      <w:lvlJc w:val="left"/>
+      <w:pPr>
+        <w:ind w:left="1440" w:hanging="1080"/>
+      </w:pPr>
+      <w:rPr>
+        <w:rFonts w:hint="default"/>
+      </w:rPr>
+    </w:lvl>
+    <w:lvl w:ilvl="4">
+      <w:start w:val="1"/>
+      <w:numFmt w:val="decimal"/>
+      <w:isLgl/>
+      <w:lvlText w:val="%1.%2.%3.%4.%5"/>
+      <w:lvlJc w:val="left"/>
+      <w:pPr>
+        <w:ind w:left="1440" w:hanging="1080"/>
+      </w:pPr>
+      <w:rPr>
+        <w:rFonts w:hint="default"/>
+      </w:rPr>
+    </w:lvl>
+    <w:lvl w:ilvl="5">
+      <w:start w:val="1"/>
+      <w:numFmt w:val="decimal"/>
+      <w:isLgl/>
+      <w:lvlText w:val="%1.%2.%3.%4.%5.%6"/>
+      <w:lvlJc w:val="left"/>
+      <w:pPr>
+        <w:ind w:left="1800" w:hanging="1440"/>
+      </w:pPr>
+      <w:rPr>
+        <w:rFonts w:hint="default"/>
+      </w:rPr>
+    </w:lvl>
+    <w:lvl w:ilvl="6">
+      <w:start w:val="1"/>
+      <w:numFmt w:val="decimal"/>
+      <w:isLgl/>
+      <w:lvlText w:val="%1.%2.%3.%4.%5.%6.%7"/>
+      <w:lvlJc w:val="left"/>
+      <w:pPr>
+        <w:ind w:left="1800" w:hanging="1440"/>
+      </w:pPr>
+      <w:rPr>
+        <w:rFonts w:hint="default"/>
+      </w:rPr>
+    </w:lvl>
+    <w:lvl w:ilvl="7">
+      <w:start w:val="1"/>
+      <w:numFmt w:val="decimal"/>
+      <w:isLgl/>
+      <w:lvlText w:val="%1.%2.%3.%4.%5.%6.%7.%8"/>
+      <w:lvlJc w:val="left"/>
+      <w:pPr>
+        <w:ind w:left="2160" w:hanging="1800"/>
+      </w:pPr>
+      <w:rPr>
+        <w:rFonts w:hint="default"/>
+      </w:rPr>
+    </w:lvl>
+    <w:lvl w:ilvl="8">
+      <w:start w:val="1"/>
+      <w:numFmt w:val="decimal"/>
+      <w:isLgl/>
+      <w:lvlText w:val="%1.%2.%3.%4.%5.%6.%7.%8.%9"/>
+      <w:lvlJc w:val="left"/>
+      <w:pPr>
+        <w:ind w:left="2160" w:hanging="1800"/>
+      </w:pPr>
+      <w:rPr>
+        <w:rFonts w:hint="default"/>
+      </w:rPr>
+    </w:lvl>
+  </w:abstractNum>
+  <w:abstractNum w:abstractNumId="3" w15:restartNumberingAfterBreak="0">
+    <w:nsid w:val="3E312054"/>
+    <w:multiLevelType w:val="multilevel"/>
+    <w:tmpl w:val="575E4706"/>
+    <w:lvl w:ilvl="0">
+      <w:start w:val="1"/>
+      <w:numFmt w:val="decimal"/>
+      <w:lvlText w:val="%1."/>
+      <w:lvlJc w:val="left"/>
+      <w:pPr>
+        <w:ind w:left="720" w:hanging="360"/>
+      </w:pPr>
+      <w:rPr>
+        <w:rFonts w:hint="default"/>
+      </w:rPr>
+    </w:lvl>
+    <w:lvl w:ilvl="1">
+      <w:start w:val="1"/>
+      <w:numFmt w:val="decimal"/>
+      <w:isLgl/>
+      <w:lvlText w:val="%1.%2"/>
+      <w:lvlJc w:val="left"/>
+      <w:pPr>
+        <w:ind w:left="792" w:hanging="432"/>
+      </w:pPr>
+      <w:rPr>
+        <w:rFonts w:hint="default"/>
+      </w:rPr>
+    </w:lvl>
+    <w:lvl w:ilvl="2">
+      <w:start w:val="1"/>
+      <w:numFmt w:val="decimal"/>
+      <w:isLgl/>
+      <w:lvlText w:val="%1.%2.%3"/>
+      <w:lvlJc w:val="left"/>
+      <w:pPr>
+        <w:ind w:left="1080" w:hanging="720"/>
+      </w:pPr>
+      <w:rPr>
+        <w:rFonts w:hint="default"/>
+      </w:rPr>
+    </w:lvl>
+    <w:lvl w:ilvl="3">
+      <w:start w:val="1"/>
+      <w:numFmt w:val="decimal"/>
+      <w:isLgl/>
+      <w:lvlText w:val="%1.%2.%3.%4"/>
+      <w:lvlJc w:val="left"/>
+      <w:pPr>
+        <w:ind w:left="1440" w:hanging="1080"/>
+      </w:pPr>
+      <w:rPr>
+        <w:rFonts w:hint="default"/>
+      </w:rPr>
+    </w:lvl>
+    <w:lvl w:ilvl="4">
+      <w:start w:val="1"/>
+      <w:numFmt w:val="decimal"/>
+      <w:isLgl/>
+      <w:lvlText w:val="%1.%2.%3.%4.%5"/>
+      <w:lvlJc w:val="left"/>
+      <w:pPr>
+        <w:ind w:left="1440" w:hanging="1080"/>
+      </w:pPr>
+      <w:rPr>
+        <w:rFonts w:hint="default"/>
+      </w:rPr>
+    </w:lvl>
+    <w:lvl w:ilvl="5">
+      <w:start w:val="1"/>
+      <w:numFmt w:val="decimal"/>
+      <w:isLgl/>
+      <w:lvlText w:val="%1.%2.%3.%4.%5.%6"/>
+      <w:lvlJc w:val="left"/>
+      <w:pPr>
+        <w:ind w:left="1800" w:hanging="1440"/>
+      </w:pPr>
+      <w:rPr>
+        <w:rFonts w:hint="default"/>
+      </w:rPr>
+    </w:lvl>
+    <w:lvl w:ilvl="6">
+      <w:start w:val="1"/>
+      <w:numFmt w:val="decimal"/>
+      <w:isLgl/>
+      <w:lvlText w:val="%1.%2.%3.%4.%5.%6.%7"/>
+      <w:lvlJc w:val="left"/>
+      <w:pPr>
+        <w:ind w:left="1800" w:hanging="1440"/>
+      </w:pPr>
+      <w:rPr>
+        <w:rFonts w:hint="default"/>
+      </w:rPr>
+    </w:lvl>
+    <w:lvl w:ilvl="7">
+      <w:start w:val="1"/>
+      <w:numFmt w:val="decimal"/>
+      <w:isLgl/>
+      <w:lvlText w:val="%1.%2.%3.%4.%5.%6.%7.%8"/>
+      <w:lvlJc w:val="left"/>
+      <w:pPr>
+        <w:ind w:left="2160" w:hanging="1800"/>
+      </w:pPr>
+      <w:rPr>
+        <w:rFonts w:hint="default"/>
+      </w:rPr>
+    </w:lvl>
+    <w:lvl w:ilvl="8">
+      <w:start w:val="1"/>
+      <w:numFmt w:val="decimal"/>
+      <w:isLgl/>
+      <w:lvlText w:val="%1.%2.%3.%4.%5.%6.%7.%8.%9"/>
+      <w:lvlJc w:val="left"/>
+      <w:pPr>
+        <w:ind w:left="2160" w:hanging="1800"/>
+      </w:pPr>
+      <w:rPr>
+        <w:rFonts w:hint="default"/>
+      </w:rPr>
+    </w:lvl>
+  </w:abstractNum>
   <w:num w:numId="1" w16cid:durableId="1418362821">
-    <w:abstractNumId w:val="0"/>
+    <w:abstractNumId w:val="2"/>
   </w:num>
   <w:num w:numId="2" w16cid:durableId="2047824675">
+    <w:abstractNumId w:val="3"/>
+  </w:num>
+  <w:num w:numId="3" w16cid:durableId="1487699588">
     <w:abstractNumId w:val="1"/>
+  </w:num>
+  <w:num w:numId="4" w16cid:durableId="1612132003">
+    <w:abstractNumId w:val="0"/>
   </w:num>
 </w:numbering>
 </file>

</xml_diff>

<commit_message>
Android Phase 4: Development
</commit_message>
<xml_diff>
--- a/docs/V-Model process - Android.docx
+++ b/docs/V-Model process - Android.docx
@@ -5191,7 +5191,180 @@
     <w:p/>
     <w:p/>
     <w:p/>
+    <w:p>
+      <w:pPr>
+        <w:pStyle w:val="Heading2"/>
+        <w:numPr>
+          <w:ilvl w:val="0"/>
+          <w:numId w:val="1"/>
+        </w:numPr>
+      </w:pPr>
+      <w:r>
+        <w:lastRenderedPageBreak/>
+        <w:t>Phase 4: Development</w:t>
+      </w:r>
+    </w:p>
     <w:p/>
+    <w:p>
+      <w:r>
+        <w:t xml:space="preserve">The development phase focused on completing the </w:t>
+      </w:r>
+      <w:proofErr w:type="spellStart"/>
+      <w:r>
+        <w:t>CarKey</w:t>
+      </w:r>
+      <w:proofErr w:type="spellEnd"/>
+      <w:r>
+        <w:t xml:space="preserve"> system, implementing cryptographic signing for unlock/lock commands, stored on hardware using Android Keystore.</w:t>
+      </w:r>
+    </w:p>
+    <w:p>
+      <w:pPr>
+        <w:pStyle w:val="ListParagraph"/>
+      </w:pPr>
+    </w:p>
+    <w:p>
+      <w:pPr>
+        <w:pStyle w:val="Heading3"/>
+        <w:numPr>
+          <w:ilvl w:val="1"/>
+          <w:numId w:val="1"/>
+        </w:numPr>
+      </w:pPr>
+      <w:r>
+        <w:t>Android Keystore Integration</w:t>
+      </w:r>
+    </w:p>
+    <w:p>
+      <w:pPr>
+        <w:pStyle w:val="ListParagraph"/>
+        <w:ind w:left="792"/>
+      </w:pPr>
+    </w:p>
+    <w:p>
+      <w:r>
+        <w:t xml:space="preserve">Cryptographic signing of messages was implemented into the </w:t>
+      </w:r>
+      <w:proofErr w:type="spellStart"/>
+      <w:r>
+        <w:t>SecurityManager</w:t>
+      </w:r>
+      <w:proofErr w:type="spellEnd"/>
+      <w:r>
+        <w:t>. Every BLE payload is signed using HMAC-SHA256, a widely used cryptographic standard. When the app is first used, the signing key is generated and stored in Android Keystore. This is a secure key enclave available on modern Android versions that stores the key directly in hardware, making it difficult to capture for an attacker. The payload format was extended to four fields:</w:t>
+      </w:r>
+    </w:p>
+    <w:p>
+      <w:pPr>
+        <w:pStyle w:val="ListParagraph"/>
+        <w:ind w:left="792"/>
+      </w:pPr>
+    </w:p>
+    <w:p>
+      <w:pPr>
+        <w:pStyle w:val="ListParagraph"/>
+        <w:ind w:left="792"/>
+      </w:pPr>
+      <w:r>
+        <w:t>[command] : [nonce] : [timestamp] : [</w:t>
+      </w:r>
+      <w:proofErr w:type="spellStart"/>
+      <w:r>
+        <w:t>hmac</w:t>
+      </w:r>
+      <w:proofErr w:type="spellEnd"/>
+      <w:r>
+        <w:t>-signature]</w:t>
+      </w:r>
+    </w:p>
+    <w:p>
+      <w:pPr>
+        <w:pStyle w:val="ListParagraph"/>
+        <w:ind w:left="792"/>
+      </w:pPr>
+    </w:p>
+    <w:p>
+      <w:r>
+        <w:t xml:space="preserve">The signature is generated using the first three fields. The </w:t>
+      </w:r>
+      <w:proofErr w:type="spellStart"/>
+      <w:r>
+        <w:t>parsePayload</w:t>
+      </w:r>
+      <w:proofErr w:type="spellEnd"/>
+      <w:r>
+        <w:t xml:space="preserve"> function verifies the signature before returning any messages. If the payload has an invalid command, bad nonce or invalid signature it is rejected and nothing is returned.</w:t>
+      </w:r>
+    </w:p>
+    <w:p>
+      <w:pPr>
+        <w:pStyle w:val="ListParagraph"/>
+        <w:ind w:left="792"/>
+      </w:pPr>
+    </w:p>
+    <w:p>
+      <w:pPr>
+        <w:pStyle w:val="Heading3"/>
+        <w:numPr>
+          <w:ilvl w:val="1"/>
+          <w:numId w:val="1"/>
+        </w:numPr>
+      </w:pPr>
+      <w:r>
+        <w:t>Tamper and Replay Protection</w:t>
+      </w:r>
+    </w:p>
+    <w:p/>
+    <w:p>
+      <w:r>
+        <w:t>The use of signatures now prevents two forms of attack:</w:t>
+      </w:r>
+    </w:p>
+    <w:p>
+      <w:r>
+        <w:t>Replay Attack: each nonce is unique, so a previously generated payload can’t be resent to trigger an action again.</w:t>
+      </w:r>
+    </w:p>
+    <w:p>
+      <w:r>
+        <w:t>Payload tampering: changing any part of the payload will invalidate the signature</w:t>
+      </w:r>
+    </w:p>
+    <w:p/>
+    <w:p>
+      <w:pPr>
+        <w:pStyle w:val="Heading3"/>
+        <w:numPr>
+          <w:ilvl w:val="1"/>
+          <w:numId w:val="1"/>
+        </w:numPr>
+      </w:pPr>
+      <w:r>
+        <w:t>Test Coverage</w:t>
+      </w:r>
+    </w:p>
+    <w:p/>
+    <w:p>
+      <w:r>
+        <w:t xml:space="preserve">Unit tests were created covering nonce generation and </w:t>
+      </w:r>
+      <w:proofErr w:type="spellStart"/>
+      <w:r>
+        <w:t>parsePayload</w:t>
+      </w:r>
+      <w:proofErr w:type="spellEnd"/>
+      <w:r>
+        <w:t xml:space="preserve"> payload rejection functionality. Tests for key signing, tamper detection, and payload verification are covered in </w:t>
+      </w:r>
+      <w:proofErr w:type="spellStart"/>
+      <w:r>
+        <w:t>SecurityManagerInstrumentedTest</w:t>
+      </w:r>
+      <w:proofErr w:type="spellEnd"/>
+      <w:r>
+        <w:t>.</w:t>
+      </w:r>
+    </w:p>
     <w:sectPr>
       <w:pgSz w:w="11906" w:h="16838"/>
       <w:pgMar w:top="1440" w:right="1440" w:bottom="1440" w:left="1440" w:header="708" w:footer="708" w:gutter="0"/>

</xml_diff>